<commit_message>
Fix bugs in deliveryagreement and add changes
</commit_message>
<xml_diff>
--- a/Vorlagen/Ablieferungsvereinbarung, Vorlage.docx
+++ b/Vorlagen/Ablieferungsvereinbarung, Vorlage.docx
@@ -208,12 +208,14 @@
             <w:r>
               <w:t>&lt;</w:t>
             </w:r>
+            <w:proofErr w:type="spellStart"/>
             <w:r>
               <w:rPr>
                 <w:highlight w:val="yellow"/>
               </w:rPr>
               <w:t>StAZHKürz</w:t>
             </w:r>
+            <w:proofErr w:type="spellEnd"/>
             <w:r>
               <w:t>&gt;</w:t>
             </w:r>
@@ -235,6 +237,7 @@
             <w:r>
               <w:t>&lt;</w:t>
             </w:r>
+            <w:proofErr w:type="spellStart"/>
             <w:r>
               <w:rPr>
                 <w:rFonts w:ascii="Avenir Next LT Pro Demi" w:hAnsi="Avenir Next LT Pro Demi"/>
@@ -242,6 +245,7 @@
               </w:rPr>
               <w:t>StAZHName</w:t>
             </w:r>
+            <w:proofErr w:type="spellEnd"/>
             <w:r>
               <w:t>&gt;</w:t>
             </w:r>
@@ -260,6 +264,7 @@
             <w:r>
               <w:t>&lt;</w:t>
             </w:r>
+            <w:proofErr w:type="spellStart"/>
             <w:r>
               <w:rPr>
                 <w:rFonts w:ascii="Avenir Next LT Pro Demi" w:hAnsi="Avenir Next LT Pro Demi"/>
@@ -267,6 +272,7 @@
               </w:rPr>
               <w:t>StAZHNummer</w:t>
             </w:r>
+            <w:proofErr w:type="spellEnd"/>
             <w:r>
               <w:t>&gt;</w:t>
             </w:r>
@@ -284,6 +290,7 @@
             <w:r>
               <w:t>&lt;</w:t>
             </w:r>
+            <w:proofErr w:type="spellStart"/>
             <w:r>
               <w:rPr>
                 <w:rFonts w:ascii="Avenir Next LT Pro Demi" w:hAnsi="Avenir Next LT Pro Demi"/>
@@ -291,6 +298,7 @@
               </w:rPr>
               <w:t>StAZHMail</w:t>
             </w:r>
+            <w:proofErr w:type="spellEnd"/>
             <w:r>
               <w:t>&gt;</w:t>
             </w:r>
@@ -309,6 +317,7 @@
               <w:t>&lt;</w:t>
             </w:r>
             <w:bookmarkStart w:id="2" w:name="_Hlk189142129"/>
+            <w:proofErr w:type="spellStart"/>
             <w:r>
               <w:rPr>
                 <w:rFonts w:ascii="Avenir Next LT Pro Demi" w:hAnsi="Avenir Next LT Pro Demi"/>
@@ -317,6 +326,7 @@
               <w:t>ErstellungsDatum</w:t>
             </w:r>
             <w:bookmarkEnd w:id="2"/>
+            <w:proofErr w:type="spellEnd"/>
             <w:r>
               <w:t>&gt;</w:t>
             </w:r>
@@ -338,13 +348,34 @@
             <w:r>
               <w:t>&lt;</w:t>
             </w:r>
+            <w:proofErr w:type="spellStart"/>
             <w:r>
               <w:rPr>
                 <w:rFonts w:ascii="Avenir Next LT Pro Demi" w:hAnsi="Avenir Next LT Pro Demi"/>
-                <w:highlight w:val="yellow"/>
+              </w:rPr>
+              <w:t>DirName</w:t>
+            </w:r>
+            <w:proofErr w:type="spellEnd"/>
+            <w:r>
+              <w:t>&gt;</w:t>
+            </w:r>
+          </w:p>
+          <w:p>
+            <w:pPr>
+              <w:pStyle w:val="51Absender"/>
+              <w:ind w:left="0" w:firstLine="0"/>
+            </w:pPr>
+            <w:r>
+              <w:t>&lt;</w:t>
+            </w:r>
+            <w:proofErr w:type="spellStart"/>
+            <w:r>
+              <w:rPr>
+                <w:rFonts w:ascii="Avenir Next LT Pro Demi" w:hAnsi="Avenir Next LT Pro Demi"/>
               </w:rPr>
               <w:t>AmtZeichen</w:t>
             </w:r>
+            <w:proofErr w:type="spellEnd"/>
             <w:r>
               <w:t>&gt;</w:t>
             </w:r>
@@ -357,6 +388,7 @@
             <w:r>
               <w:t>&lt;</w:t>
             </w:r>
+            <w:proofErr w:type="spellStart"/>
             <w:r>
               <w:rPr>
                 <w:rFonts w:ascii="Avenir Next LT Pro Demi" w:hAnsi="Avenir Next LT Pro Demi"/>
@@ -364,6 +396,7 @@
               </w:rPr>
               <w:t>AmtPName</w:t>
             </w:r>
+            <w:proofErr w:type="spellEnd"/>
             <w:r>
               <w:t>&gt;</w:t>
             </w:r>
@@ -493,6 +526,7 @@
       <w:r>
         <w:t>&lt;</w:t>
       </w:r>
+      <w:proofErr w:type="spellStart"/>
       <w:r>
         <w:rPr>
           <w:rFonts w:ascii="Avenir Next LT Pro Demi" w:hAnsi="Avenir Next LT Pro Demi"/>
@@ -500,6 +534,7 @@
         </w:rPr>
         <w:t>BesDatum</w:t>
       </w:r>
+      <w:proofErr w:type="spellEnd"/>
       <w:r>
         <w:rPr>
           <w:sz w:val="20"/>
@@ -554,6 +589,7 @@
       <w:r>
         <w:t>&lt;</w:t>
       </w:r>
+      <w:proofErr w:type="spellStart"/>
       <w:r>
         <w:rPr>
           <w:rFonts w:ascii="Avenir Next LT Pro Demi" w:hAnsi="Avenir Next LT Pro Demi"/>
@@ -561,6 +597,7 @@
         </w:rPr>
         <w:t>BesDatum</w:t>
       </w:r>
+      <w:proofErr w:type="spellEnd"/>
       <w:r>
         <w:t>&gt;</w:t>
       </w:r>
@@ -631,6 +668,7 @@
         </w:rPr>
         <w:t>&lt;</w:t>
       </w:r>
+      <w:proofErr w:type="spellStart"/>
       <w:r>
         <w:rPr>
           <w:rFonts w:asciiTheme="majorHAnsi" w:hAnsiTheme="majorHAnsi" w:cstheme="majorHAnsi"/>
@@ -640,6 +678,7 @@
         </w:rPr>
         <w:t>StAZHName</w:t>
       </w:r>
+      <w:proofErr w:type="spellEnd"/>
       <w:r>
         <w:rPr>
           <w:rFonts w:asciiTheme="majorHAnsi" w:hAnsiTheme="majorHAnsi" w:cstheme="majorHAnsi"/>
@@ -663,12 +702,14 @@
       <w:r>
         <w:t>&lt;</w:t>
       </w:r>
+      <w:proofErr w:type="spellStart"/>
       <w:r>
         <w:rPr>
           <w:highlight w:val="yellow"/>
         </w:rPr>
         <w:t>AblJahr</w:t>
       </w:r>
+      <w:proofErr w:type="spellEnd"/>
       <w:r>
         <w:t>&gt;</w:t>
       </w:r>
@@ -681,12 +722,14 @@
         </w:rPr>
         <w:t>&lt;</w:t>
       </w:r>
+      <w:proofErr w:type="spellStart"/>
       <w:r>
         <w:rPr>
           <w:highlight w:val="yellow"/>
         </w:rPr>
         <w:t>AmtZeichen</w:t>
       </w:r>
+      <w:proofErr w:type="spellEnd"/>
       <w:r>
         <w:rPr>
           <w:highlight w:val="yellow"/>
@@ -697,7 +740,15 @@
         <w:t xml:space="preserve"> </w:t>
       </w:r>
       <w:r>
-        <w:t>und dem Staatsarchiv des Kantons Zürich (StAZH)</w:t>
+        <w:t>und dem Staatsarchiv des Kantons Zürich (</w:t>
+      </w:r>
+      <w:proofErr w:type="spellStart"/>
+      <w:r>
+        <w:t>StAZH</w:t>
+      </w:r>
+      <w:proofErr w:type="spellEnd"/>
+      <w:r>
+        <w:t>)</w:t>
       </w:r>
     </w:p>
     <w:p>
@@ -733,6 +784,7 @@
         </w:rPr>
         <w:t xml:space="preserve"> &lt;</w:t>
       </w:r>
+      <w:proofErr w:type="spellStart"/>
       <w:r>
         <w:rPr>
           <w:rFonts w:asciiTheme="majorHAnsi" w:hAnsiTheme="majorHAnsi" w:cstheme="majorHAnsi"/>
@@ -741,6 +793,7 @@
         </w:rPr>
         <w:t>AmtZeichen</w:t>
       </w:r>
+      <w:proofErr w:type="spellEnd"/>
       <w:r>
         <w:rPr>
           <w:i/>
@@ -766,6 +819,7 @@
         </w:rPr>
         <w:t xml:space="preserve"> &lt;</w:t>
       </w:r>
+      <w:proofErr w:type="spellStart"/>
       <w:r>
         <w:rPr>
           <w:rFonts w:asciiTheme="majorHAnsi" w:hAnsiTheme="majorHAnsi" w:cstheme="majorHAnsi"/>
@@ -774,6 +828,7 @@
         </w:rPr>
         <w:t>AmtPName</w:t>
       </w:r>
+      <w:proofErr w:type="spellEnd"/>
       <w:r>
         <w:rPr>
           <w:i/>
@@ -802,6 +857,7 @@
         </w:rPr>
         <w:t>&lt;</w:t>
       </w:r>
+      <w:proofErr w:type="spellStart"/>
       <w:r>
         <w:rPr>
           <w:rFonts w:asciiTheme="majorHAnsi" w:hAnsiTheme="majorHAnsi" w:cstheme="majorHAnsi"/>
@@ -820,6 +876,7 @@
         </w:rPr>
         <w:t>Name</w:t>
       </w:r>
+      <w:proofErr w:type="spellEnd"/>
       <w:r>
         <w:rPr>
           <w:bCs/>
@@ -903,6 +960,7 @@
         </w:rPr>
         <w:t>&lt;</w:t>
       </w:r>
+      <w:proofErr w:type="spellStart"/>
       <w:r>
         <w:rPr>
           <w:rFonts w:asciiTheme="majorHAnsi" w:hAnsiTheme="majorHAnsi" w:cstheme="majorHAnsi"/>
@@ -912,6 +970,7 @@
         </w:rPr>
         <w:t>AngDatum</w:t>
       </w:r>
+      <w:proofErr w:type="spellEnd"/>
       <w:r>
         <w:rPr>
           <w:bCs/>
@@ -961,6 +1020,7 @@
         </w:rPr>
         <w:t>&lt;</w:t>
       </w:r>
+      <w:proofErr w:type="spellStart"/>
       <w:r>
         <w:rPr>
           <w:rFonts w:asciiTheme="majorHAnsi" w:hAnsiTheme="majorHAnsi" w:cstheme="majorHAnsi"/>
@@ -969,6 +1029,7 @@
         </w:rPr>
         <w:t>BesDatum</w:t>
       </w:r>
+      <w:proofErr w:type="spellEnd"/>
       <w:r>
         <w:rPr>
           <w:i/>
@@ -987,6 +1048,7 @@
         </w:rPr>
         <w:t>&lt;</w:t>
       </w:r>
+      <w:proofErr w:type="spellStart"/>
       <w:r>
         <w:rPr>
           <w:i/>
@@ -994,6 +1056,7 @@
         </w:rPr>
         <w:t>AmtPName</w:t>
       </w:r>
+      <w:proofErr w:type="spellEnd"/>
       <w:r>
         <w:rPr>
           <w:i/>
@@ -1016,20 +1079,42 @@
         <w:rPr>
           <w:i/>
         </w:rPr>
-        <w:t>&lt;StAZHName&gt;</w:t>
-      </w:r>
+        <w:t>&lt;</w:t>
+      </w:r>
+      <w:proofErr w:type="spellStart"/>
       <w:r>
         <w:rPr>
           <w:i/>
         </w:rPr>
+        <w:t>StAZHName</w:t>
+      </w:r>
+      <w:proofErr w:type="spellEnd"/>
+      <w:r>
+        <w:rPr>
+          <w:i/>
+        </w:rPr>
+        <w:t>&gt;</w:t>
+      </w:r>
+      <w:r>
+        <w:rPr>
+          <w:i/>
+        </w:rPr>
         <w:t>,</w:t>
       </w:r>
       <w:r>
         <w:rPr>
           <w:i/>
         </w:rPr>
-        <w:t xml:space="preserve"> StAZH</w:t>
-      </w:r>
+        <w:t xml:space="preserve"> </w:t>
+      </w:r>
+      <w:proofErr w:type="spellStart"/>
+      <w:r>
+        <w:rPr>
+          <w:i/>
+        </w:rPr>
+        <w:t>StAZH</w:t>
+      </w:r>
+      <w:proofErr w:type="spellEnd"/>
       <w:r>
         <w:rPr>
           <w:i/>
@@ -1056,9 +1141,11 @@
         </w:rPr>
         <w:t>&lt;</w:t>
       </w:r>
+      <w:proofErr w:type="spellStart"/>
       <w:r>
         <w:t>ErstellungsDatum</w:t>
       </w:r>
+      <w:proofErr w:type="spellEnd"/>
       <w:r>
         <w:rPr>
           <w:i/>
@@ -1123,7 +1210,21 @@
         <w:rPr>
           <w:highlight w:val="yellow"/>
         </w:rPr>
-        <w:t>bereits vorhandene Bestände im StAZH.</w:t>
+        <w:t xml:space="preserve">bereits vorhandene Bestände im </w:t>
+      </w:r>
+      <w:proofErr w:type="spellStart"/>
+      <w:r>
+        <w:rPr>
+          <w:highlight w:val="yellow"/>
+        </w:rPr>
+        <w:t>StAZH</w:t>
+      </w:r>
+      <w:proofErr w:type="spellEnd"/>
+      <w:r>
+        <w:rPr>
+          <w:highlight w:val="yellow"/>
+        </w:rPr>
+        <w:t>.</w:t>
       </w:r>
     </w:p>
     <w:p>
@@ -1139,6 +1240,7 @@
       <w:r>
         <w:t>&lt;</w:t>
       </w:r>
+      <w:proofErr w:type="spellStart"/>
       <w:r>
         <w:rPr>
           <w:rFonts w:asciiTheme="majorHAnsi" w:hAnsiTheme="majorHAnsi" w:cstheme="majorHAnsi"/>
@@ -1146,6 +1248,7 @@
         </w:rPr>
         <w:t>AngLfm</w:t>
       </w:r>
+      <w:proofErr w:type="spellEnd"/>
       <w:r>
         <w:t>&gt;</w:t>
       </w:r>
@@ -1164,6 +1267,7 @@
       <w:r>
         <w:t>&lt;</w:t>
       </w:r>
+      <w:proofErr w:type="spellStart"/>
       <w:r>
         <w:rPr>
           <w:rFonts w:asciiTheme="majorHAnsi" w:hAnsiTheme="majorHAnsi" w:cstheme="majorHAnsi"/>
@@ -1171,6 +1275,7 @@
         </w:rPr>
         <w:t>AngGB</w:t>
       </w:r>
+      <w:proofErr w:type="spellEnd"/>
       <w:r>
         <w:t>&gt;</w:t>
       </w:r>
@@ -1213,9 +1318,11 @@
       <w:r>
         <w:t xml:space="preserve">Das </w:t>
       </w:r>
+      <w:proofErr w:type="spellStart"/>
       <w:r>
         <w:t>StAZH</w:t>
       </w:r>
+      <w:proofErr w:type="spellEnd"/>
       <w:r>
         <w:t xml:space="preserve"> übernimmt ca</w:t>
       </w:r>
@@ -1225,6 +1332,7 @@
       <w:r>
         <w:t>&lt;</w:t>
       </w:r>
+      <w:proofErr w:type="spellStart"/>
       <w:r>
         <w:rPr>
           <w:rFonts w:asciiTheme="majorHAnsi" w:hAnsiTheme="majorHAnsi" w:cstheme="majorHAnsi"/>
@@ -1232,6 +1340,7 @@
         </w:rPr>
         <w:t>ÜbernLfm</w:t>
       </w:r>
+      <w:proofErr w:type="spellEnd"/>
       <w:r>
         <w:t>&gt;</w:t>
       </w:r>
@@ -1244,6 +1353,7 @@
       <w:r>
         <w:t>&lt;</w:t>
       </w:r>
+      <w:proofErr w:type="spellStart"/>
       <w:r>
         <w:rPr>
           <w:rFonts w:asciiTheme="majorHAnsi" w:hAnsiTheme="majorHAnsi" w:cstheme="majorHAnsi"/>
@@ -1258,6 +1368,7 @@
         </w:rPr>
         <w:t>GB</w:t>
       </w:r>
+      <w:proofErr w:type="spellEnd"/>
       <w:r>
         <w:t>&gt;</w:t>
       </w:r>
@@ -1276,13 +1387,29 @@
         <w:pStyle w:val="00Vorgabetext"/>
       </w:pPr>
       <w:r>
-        <w:t>Im Folgenden werden die Vereinbarungen zur dauernden Archivierung im StAZH pro Aktengruppe festgehalten (L</w:t>
+        <w:t xml:space="preserve">Im Folgenden werden die Vereinbarungen zur dauernden Archivierung im </w:t>
+      </w:r>
+      <w:proofErr w:type="spellStart"/>
+      <w:r>
+        <w:t>StAZH</w:t>
+      </w:r>
+      <w:proofErr w:type="spellEnd"/>
+      <w:r>
+        <w:t xml:space="preserve"> pro Aktengruppe festgehalten (</w:t>
+      </w:r>
+      <w:proofErr w:type="spellStart"/>
+      <w:r>
+        <w:t>L</w:t>
       </w:r>
       <w:r>
         <w:t>f</w:t>
       </w:r>
       <w:r>
-        <w:t>m = Laufmeter).</w:t>
+        <w:t>m</w:t>
+      </w:r>
+      <w:proofErr w:type="spellEnd"/>
+      <w:r>
+        <w:t xml:space="preserve"> = Laufmeter).</w:t>
       </w:r>
       <w:r>
         <w:t xml:space="preserve"> In der linken Spalte ("Aktengruppe") ist das gesamte ursprüngliche Angebot wiedergegeben.</w:t>
@@ -1292,11 +1419,19 @@
       <w:pPr>
         <w:pStyle w:val="00Vorgabetext"/>
       </w:pPr>
+      <w:proofErr w:type="gramStart"/>
       <w:r>
         <w:rPr>
           <w:highlight w:val="yellow"/>
         </w:rPr>
-        <w:t>Kann auch Vereinbarungen zu Aktengruppen enthalten, welche erst später angeboten werden.</w:t>
+        <w:t>Kann</w:t>
+      </w:r>
+      <w:proofErr w:type="gramEnd"/>
+      <w:r>
+        <w:rPr>
+          <w:highlight w:val="yellow"/>
+        </w:rPr>
+        <w:t xml:space="preserve"> auch Vereinbarungen zu Aktengruppen enthalten, welche erst später angeboten werden.</w:t>
       </w:r>
     </w:p>
     <w:p>
@@ -1423,7 +1558,23 @@
                 <w:sz w:val="20"/>
                 <w:szCs w:val="20"/>
               </w:rPr>
-              <w:t xml:space="preserve"> in Lfm/GB</w:t>
+              <w:t xml:space="preserve"> in </w:t>
+            </w:r>
+            <w:proofErr w:type="spellStart"/>
+            <w:r>
+              <w:rPr>
+                <w:sz w:val="20"/>
+                <w:szCs w:val="20"/>
+              </w:rPr>
+              <w:t>Lfm</w:t>
+            </w:r>
+            <w:proofErr w:type="spellEnd"/>
+            <w:r>
+              <w:rPr>
+                <w:sz w:val="20"/>
+                <w:szCs w:val="20"/>
+              </w:rPr>
+              <w:t>/GB</w:t>
             </w:r>
           </w:p>
         </w:tc>
@@ -1448,7 +1599,25 @@
                 <w:szCs w:val="20"/>
                 <w:highlight w:val="yellow"/>
               </w:rPr>
-              <w:t>N.N., Laufzeit (Umfang in Lfm)</w:t>
+              <w:t xml:space="preserve">N.N., Laufzeit (Umfang in </w:t>
+            </w:r>
+            <w:proofErr w:type="spellStart"/>
+            <w:r>
+              <w:rPr>
+                <w:sz w:val="20"/>
+                <w:szCs w:val="20"/>
+                <w:highlight w:val="yellow"/>
+              </w:rPr>
+              <w:t>Lfm</w:t>
+            </w:r>
+            <w:proofErr w:type="spellEnd"/>
+            <w:r>
+              <w:rPr>
+                <w:sz w:val="20"/>
+                <w:szCs w:val="20"/>
+                <w:highlight w:val="yellow"/>
+              </w:rPr>
+              <w:t>)</w:t>
             </w:r>
           </w:p>
         </w:tc>
@@ -1553,8 +1722,18 @@
                 <w:szCs w:val="20"/>
                 <w:highlight w:val="yellow"/>
               </w:rPr>
-              <w:t>Umfang in Lfm</w:t>
-            </w:r>
+              <w:t xml:space="preserve">Umfang in </w:t>
+            </w:r>
+            <w:proofErr w:type="spellStart"/>
+            <w:r>
+              <w:rPr>
+                <w:sz w:val="20"/>
+                <w:szCs w:val="20"/>
+                <w:highlight w:val="yellow"/>
+              </w:rPr>
+              <w:t>Lfm</w:t>
+            </w:r>
+            <w:proofErr w:type="spellEnd"/>
           </w:p>
         </w:tc>
       </w:tr>
@@ -1578,7 +1757,25 @@
                 <w:szCs w:val="20"/>
                 <w:highlight w:val="yellow"/>
               </w:rPr>
-              <w:t>N.N., Laufzeit (Umfang in Lfm)</w:t>
+              <w:t xml:space="preserve">N.N., Laufzeit (Umfang in </w:t>
+            </w:r>
+            <w:proofErr w:type="spellStart"/>
+            <w:r>
+              <w:rPr>
+                <w:sz w:val="20"/>
+                <w:szCs w:val="20"/>
+                <w:highlight w:val="yellow"/>
+              </w:rPr>
+              <w:t>Lfm</w:t>
+            </w:r>
+            <w:proofErr w:type="spellEnd"/>
+            <w:r>
+              <w:rPr>
+                <w:sz w:val="20"/>
+                <w:szCs w:val="20"/>
+                <w:highlight w:val="yellow"/>
+              </w:rPr>
+              <w:t>)</w:t>
             </w:r>
           </w:p>
         </w:tc>
@@ -1683,8 +1880,18 @@
                 <w:szCs w:val="20"/>
                 <w:highlight w:val="yellow"/>
               </w:rPr>
-              <w:t>Umfang in Lfm</w:t>
-            </w:r>
+              <w:t xml:space="preserve">Umfang in </w:t>
+            </w:r>
+            <w:proofErr w:type="spellStart"/>
+            <w:r>
+              <w:rPr>
+                <w:sz w:val="20"/>
+                <w:szCs w:val="20"/>
+                <w:highlight w:val="yellow"/>
+              </w:rPr>
+              <w:t>Lfm</w:t>
+            </w:r>
+            <w:proofErr w:type="spellEnd"/>
           </w:p>
         </w:tc>
       </w:tr>
@@ -1720,6 +1927,7 @@
         </w:rPr>
         <w:t xml:space="preserve">Die Aufbewahrungsfrist der folgenden Aktengruppen ist noch nicht abgelaufen. Diese müssen weiterhin aufbewahrt und bei Ablauf der Aufbewahrungsfrist erneut dem </w:t>
       </w:r>
+      <w:proofErr w:type="spellStart"/>
       <w:r>
         <w:rPr>
           <w:rFonts w:cs="Arial"/>
@@ -1727,6 +1935,7 @@
         </w:rPr>
         <w:t>StAZH</w:t>
       </w:r>
+      <w:proofErr w:type="spellEnd"/>
       <w:r>
         <w:rPr>
           <w:rFonts w:cs="Arial"/>
@@ -1818,7 +2027,23 @@
                 <w:sz w:val="20"/>
                 <w:szCs w:val="20"/>
               </w:rPr>
-              <w:t xml:space="preserve"> in Lfm/GB</w:t>
+              <w:t xml:space="preserve"> in </w:t>
+            </w:r>
+            <w:proofErr w:type="spellStart"/>
+            <w:r>
+              <w:rPr>
+                <w:sz w:val="20"/>
+                <w:szCs w:val="20"/>
+              </w:rPr>
+              <w:t>Lfm</w:t>
+            </w:r>
+            <w:proofErr w:type="spellEnd"/>
+            <w:r>
+              <w:rPr>
+                <w:sz w:val="20"/>
+                <w:szCs w:val="20"/>
+              </w:rPr>
+              <w:t>/GB</w:t>
             </w:r>
           </w:p>
         </w:tc>
@@ -1843,7 +2068,25 @@
                 <w:szCs w:val="20"/>
                 <w:highlight w:val="yellow"/>
               </w:rPr>
-              <w:t>N.N., Laufzeit (Umfang in Lfm)</w:t>
+              <w:t xml:space="preserve">N.N., Laufzeit (Umfang in </w:t>
+            </w:r>
+            <w:proofErr w:type="spellStart"/>
+            <w:r>
+              <w:rPr>
+                <w:sz w:val="20"/>
+                <w:szCs w:val="20"/>
+                <w:highlight w:val="yellow"/>
+              </w:rPr>
+              <w:t>Lfm</w:t>
+            </w:r>
+            <w:proofErr w:type="spellEnd"/>
+            <w:r>
+              <w:rPr>
+                <w:sz w:val="20"/>
+                <w:szCs w:val="20"/>
+                <w:highlight w:val="yellow"/>
+              </w:rPr>
+              <w:t>)</w:t>
             </w:r>
           </w:p>
         </w:tc>
@@ -1866,8 +2109,18 @@
                 <w:szCs w:val="20"/>
                 <w:highlight w:val="yellow"/>
               </w:rPr>
-              <w:t>Umfang in Lfm</w:t>
-            </w:r>
+              <w:t xml:space="preserve">Umfang in </w:t>
+            </w:r>
+            <w:proofErr w:type="spellStart"/>
+            <w:r>
+              <w:rPr>
+                <w:sz w:val="20"/>
+                <w:szCs w:val="20"/>
+                <w:highlight w:val="yellow"/>
+              </w:rPr>
+              <w:t>Lfm</w:t>
+            </w:r>
+            <w:proofErr w:type="spellEnd"/>
           </w:p>
         </w:tc>
       </w:tr>
@@ -1891,7 +2144,25 @@
                 <w:szCs w:val="20"/>
                 <w:highlight w:val="yellow"/>
               </w:rPr>
-              <w:t>N.N., Laufzeit (Umfang in Lfm)</w:t>
+              <w:t xml:space="preserve">N.N., Laufzeit (Umfang in </w:t>
+            </w:r>
+            <w:proofErr w:type="spellStart"/>
+            <w:r>
+              <w:rPr>
+                <w:sz w:val="20"/>
+                <w:szCs w:val="20"/>
+                <w:highlight w:val="yellow"/>
+              </w:rPr>
+              <w:t>Lfm</w:t>
+            </w:r>
+            <w:proofErr w:type="spellEnd"/>
+            <w:r>
+              <w:rPr>
+                <w:sz w:val="20"/>
+                <w:szCs w:val="20"/>
+                <w:highlight w:val="yellow"/>
+              </w:rPr>
+              <w:t>)</w:t>
             </w:r>
           </w:p>
         </w:tc>
@@ -1914,8 +2185,18 @@
                 <w:szCs w:val="20"/>
                 <w:highlight w:val="yellow"/>
               </w:rPr>
-              <w:t>Umfang in Lfm</w:t>
-            </w:r>
+              <w:t xml:space="preserve">Umfang in </w:t>
+            </w:r>
+            <w:proofErr w:type="spellStart"/>
+            <w:r>
+              <w:rPr>
+                <w:sz w:val="20"/>
+                <w:szCs w:val="20"/>
+                <w:highlight w:val="yellow"/>
+              </w:rPr>
+              <w:t>Lfm</w:t>
+            </w:r>
+            <w:proofErr w:type="spellEnd"/>
           </w:p>
         </w:tc>
       </w:tr>
@@ -1966,7 +2247,21 @@
         <w:rPr>
           <w:bCs/>
         </w:rPr>
-        <w:t xml:space="preserve">Das StAZH übernimmt </w:t>
+        <w:t xml:space="preserve">Das </w:t>
+      </w:r>
+      <w:proofErr w:type="spellStart"/>
+      <w:r>
+        <w:rPr>
+          <w:bCs/>
+        </w:rPr>
+        <w:t>StAZH</w:t>
+      </w:r>
+      <w:proofErr w:type="spellEnd"/>
+      <w:r>
+        <w:rPr>
+          <w:bCs/>
+        </w:rPr>
+        <w:t xml:space="preserve"> übernimmt </w:t>
       </w:r>
       <w:r>
         <w:rPr>
@@ -2022,7 +2317,21 @@
         <w:rPr>
           <w:bCs/>
         </w:rPr>
-        <w:t>Personaldossiers wird eine zweistufige Auswahl nach folgendem Muster übernommen:</w:t>
+        <w:t xml:space="preserve">Personaldossiers wird eine zweistufige Auswahl </w:t>
+      </w:r>
+      <w:proofErr w:type="gramStart"/>
+      <w:r>
+        <w:rPr>
+          <w:bCs/>
+        </w:rPr>
+        <w:t>nach folgendem</w:t>
+      </w:r>
+      <w:proofErr w:type="gramEnd"/>
+      <w:r>
+        <w:rPr>
+          <w:bCs/>
+        </w:rPr>
+        <w:t xml:space="preserve"> Muster übernommen:</w:t>
       </w:r>
     </w:p>
     <w:p>
@@ -2061,7 +2370,15 @@
         <w:t>inhaltliche Auswahl</w:t>
       </w:r>
       <w:r>
-        <w:t xml:space="preserve"> nach folgenden Kriterien: </w:t>
+        <w:t xml:space="preserve"> </w:t>
+      </w:r>
+      <w:proofErr w:type="gramStart"/>
+      <w:r>
+        <w:t>nach folgenden</w:t>
+      </w:r>
+      <w:proofErr w:type="gramEnd"/>
+      <w:r>
+        <w:t xml:space="preserve"> Kriterien: </w:t>
       </w:r>
     </w:p>
     <w:p>
@@ -2185,7 +2502,21 @@
         <w:rPr>
           <w:highlight w:val="yellow"/>
         </w:rPr>
-        <w:t>[Der/die/das Name der abliefernden Stelle]</w:t>
+        <w:t>[Der/die/</w:t>
+      </w:r>
+      <w:proofErr w:type="gramStart"/>
+      <w:r>
+        <w:rPr>
+          <w:highlight w:val="yellow"/>
+        </w:rPr>
+        <w:t>das Name</w:t>
+      </w:r>
+      <w:proofErr w:type="gramEnd"/>
+      <w:r>
+        <w:rPr>
+          <w:highlight w:val="yellow"/>
+        </w:rPr>
+        <w:t xml:space="preserve"> der abliefernden Stelle]</w:t>
       </w:r>
       <w:r>
         <w:t xml:space="preserve"> vermerkt den jeweiligen Auswahlgrund (systematische Auswahl / inhaltliche Auswahl + Nr. Kriterium) im Verzeichnis sämtlicher Personaldossiers. </w:t>
@@ -2194,7 +2525,21 @@
         <w:rPr>
           <w:highlight w:val="yellow"/>
         </w:rPr>
-        <w:t>[Falls das nicht geht (z. B. weil kein Verzeichnis vorhanden ist oder angefertigt werden kann), muss hier definiert werden, wie die Auswahlkriterien festgehalten werden, damit noch klar ist</w:t>
+        <w:t>[Falls das nicht geht (z. </w:t>
+      </w:r>
+      <w:proofErr w:type="gramStart"/>
+      <w:r>
+        <w:rPr>
+          <w:highlight w:val="yellow"/>
+        </w:rPr>
+        <w:t>B.</w:t>
+      </w:r>
+      <w:proofErr w:type="gramEnd"/>
+      <w:r>
+        <w:rPr>
+          <w:highlight w:val="yellow"/>
+        </w:rPr>
+        <w:t xml:space="preserve"> weil kein Verzeichnis vorhanden ist oder angefertigt werden kann), muss hier definiert werden, wie die Auswahlkriterien festgehalten werden, damit noch klar ist</w:t>
       </w:r>
       <w:r>
         <w:rPr>
@@ -2279,7 +2624,21 @@
         <w:rPr>
           <w:b/>
         </w:rPr>
-        <w:t>Unterlagen war bereits vor der Ablieferung an das StAZH öffentlich einsehbar</w:t>
+        <w:t xml:space="preserve">Unterlagen war bereits vor der Ablieferung an das </w:t>
+      </w:r>
+      <w:proofErr w:type="spellStart"/>
+      <w:r>
+        <w:rPr>
+          <w:b/>
+        </w:rPr>
+        <w:t>StAZH</w:t>
+      </w:r>
+      <w:proofErr w:type="spellEnd"/>
+      <w:r>
+        <w:rPr>
+          <w:b/>
+        </w:rPr>
+        <w:t xml:space="preserve"> öffentlich einsehbar</w:t>
       </w:r>
       <w:r>
         <w:t xml:space="preserve"> und bleib</w:t>
@@ -2288,7 +2647,15 @@
         <w:t>t</w:t>
       </w:r>
       <w:r>
-        <w:t xml:space="preserve"> damit auch im StAZH weiterhin frei zugänglich.</w:t>
+        <w:t xml:space="preserve"> damit auch im </w:t>
+      </w:r>
+      <w:proofErr w:type="spellStart"/>
+      <w:r>
+        <w:t>StAZH</w:t>
+      </w:r>
+      <w:proofErr w:type="spellEnd"/>
+      <w:r>
+        <w:t xml:space="preserve"> weiterhin frei zugänglich.</w:t>
       </w:r>
       <w:r>
         <w:t xml:space="preserve"> Diese Unterlagen sind in der obenstehenden Liste mit *** gekennzeichnet.</w:t>
@@ -2502,8 +2869,16 @@
         <w:rPr>
           <w:highlight w:val="yellow"/>
         </w:rPr>
-        <w:t>Nächste Schritte: Amtsstelle, StAZH</w:t>
-      </w:r>
+        <w:t xml:space="preserve">Nächste Schritte: Amtsstelle, </w:t>
+      </w:r>
+      <w:proofErr w:type="spellStart"/>
+      <w:r>
+        <w:rPr>
+          <w:highlight w:val="yellow"/>
+        </w:rPr>
+        <w:t>StAZH</w:t>
+      </w:r>
+      <w:proofErr w:type="spellEnd"/>
       <w:r>
         <w:t>.</w:t>
       </w:r>
@@ -2516,7 +2891,15 @@
         <w:pStyle w:val="00Vorgabetext"/>
       </w:pPr>
       <w:r>
-        <w:t>Zu den Akten erstellt das StAZH ein Ablieferungsverzeichnis (ähnlich wie oben Punkt</w:t>
+        <w:t xml:space="preserve">Zu den Akten erstellt das </w:t>
+      </w:r>
+      <w:proofErr w:type="spellStart"/>
+      <w:r>
+        <w:t>StAZH</w:t>
+      </w:r>
+      <w:proofErr w:type="spellEnd"/>
+      <w:r>
+        <w:t xml:space="preserve"> ein Ablieferungsverzeichnis (ähnlich wie oben Punkt</w:t>
       </w:r>
       <w:r>
         <w:t> </w:t>
@@ -2530,6 +2913,7 @@
         </w:rPr>
         <w:t>&lt;</w:t>
       </w:r>
+      <w:proofErr w:type="spellStart"/>
       <w:r>
         <w:rPr>
           <w:rFonts w:asciiTheme="majorHAnsi" w:hAnsiTheme="majorHAnsi" w:cstheme="majorHAnsi"/>
@@ -2537,6 +2921,7 @@
         </w:rPr>
         <w:t>AmtZeichen</w:t>
       </w:r>
+      <w:proofErr w:type="spellEnd"/>
       <w:r>
         <w:rPr>
           <w:highlight w:val="yellow"/>
@@ -2556,7 +2941,15 @@
         <w:t>ans</w:t>
       </w:r>
       <w:r>
-        <w:t xml:space="preserve"> StAZH.</w:t>
+        <w:t xml:space="preserve"> </w:t>
+      </w:r>
+      <w:proofErr w:type="spellStart"/>
+      <w:r>
+        <w:t>StAZH</w:t>
+      </w:r>
+      <w:proofErr w:type="spellEnd"/>
+      <w:r>
+        <w:t>.</w:t>
       </w:r>
     </w:p>
     <w:p>
@@ -2602,7 +2995,23 @@
           <w:rFonts w:ascii="Helv" w:hAnsi="Helv" w:cs="Helv"/>
           <w:color w:val="000000"/>
         </w:rPr>
-        <w:t>Das StAZH muss über die Ursprungsmengen informiert sein, um seine Übernahmequoten</w:t>
+        <w:t xml:space="preserve">Das </w:t>
+      </w:r>
+      <w:proofErr w:type="spellStart"/>
+      <w:r>
+        <w:rPr>
+          <w:rFonts w:ascii="Helv" w:hAnsi="Helv" w:cs="Helv"/>
+          <w:color w:val="000000"/>
+        </w:rPr>
+        <w:t>StAZH</w:t>
+      </w:r>
+      <w:proofErr w:type="spellEnd"/>
+      <w:r>
+        <w:rPr>
+          <w:rFonts w:ascii="Helv" w:hAnsi="Helv" w:cs="Helv"/>
+          <w:color w:val="000000"/>
+        </w:rPr>
+        <w:t xml:space="preserve"> muss über die Ursprungsmengen informiert sein, um seine Übernahmequoten</w:t>
       </w:r>
       <w:r>
         <w:rPr>
@@ -2683,7 +3092,15 @@
         <w:t>dl</w:t>
       </w:r>
       <w:r>
-        <w:t>iche Arten dem StAZH übergeben werden:</w:t>
+        <w:t xml:space="preserve">iche Arten dem </w:t>
+      </w:r>
+      <w:proofErr w:type="spellStart"/>
+      <w:r>
+        <w:t>StAZH</w:t>
+      </w:r>
+      <w:proofErr w:type="spellEnd"/>
+      <w:r>
+        <w:t xml:space="preserve"> übergeben werden:</w:t>
       </w:r>
     </w:p>
     <w:p/>
@@ -2714,7 +3131,49 @@
         <w:rPr>
           <w:highlight w:val="yellow"/>
         </w:rPr>
-        <w:t>mittels gesichertem und verschlüsseltem WebTransferZH. Sollte kein eigener Zugang zum 'WebTransferZH vorhanden sein, versendet das StAZH eine Einladung;</w:t>
+        <w:t xml:space="preserve">mittels gesichertem und verschlüsseltem </w:t>
+      </w:r>
+      <w:proofErr w:type="spellStart"/>
+      <w:r>
+        <w:rPr>
+          <w:highlight w:val="yellow"/>
+        </w:rPr>
+        <w:t>WebTransferZH</w:t>
+      </w:r>
+      <w:proofErr w:type="spellEnd"/>
+      <w:r>
+        <w:rPr>
+          <w:highlight w:val="yellow"/>
+        </w:rPr>
+        <w:t>. Sollte kein eigener Zugang zum '</w:t>
+      </w:r>
+      <w:proofErr w:type="spellStart"/>
+      <w:r>
+        <w:rPr>
+          <w:highlight w:val="yellow"/>
+        </w:rPr>
+        <w:t>WebTransferZH</w:t>
+      </w:r>
+      <w:proofErr w:type="spellEnd"/>
+      <w:r>
+        <w:rPr>
+          <w:highlight w:val="yellow"/>
+        </w:rPr>
+        <w:t xml:space="preserve"> vorhanden sein, versendet das </w:t>
+      </w:r>
+      <w:proofErr w:type="spellStart"/>
+      <w:r>
+        <w:rPr>
+          <w:highlight w:val="yellow"/>
+        </w:rPr>
+        <w:t>StAZH</w:t>
+      </w:r>
+      <w:proofErr w:type="spellEnd"/>
+      <w:r>
+        <w:rPr>
+          <w:highlight w:val="yellow"/>
+        </w:rPr>
+        <w:t xml:space="preserve"> eine Einladung;</w:t>
       </w:r>
     </w:p>
     <w:p>
@@ -2744,7 +3203,35 @@
         <w:rPr>
           <w:highlight w:val="yellow"/>
         </w:rPr>
-        <w:t>mittels eigener gesicherter und verschlüsselter Transfer-Services, wobei das Zugangspasswort dem StAZH in einer separaten E-Mail mitgeteilt werden so ll;</w:t>
+        <w:t xml:space="preserve">mittels eigener gesicherter und verschlüsselter Transfer-Services, wobei das Zugangspasswort dem </w:t>
+      </w:r>
+      <w:proofErr w:type="spellStart"/>
+      <w:r>
+        <w:rPr>
+          <w:highlight w:val="yellow"/>
+        </w:rPr>
+        <w:t>StAZH</w:t>
+      </w:r>
+      <w:proofErr w:type="spellEnd"/>
+      <w:r>
+        <w:rPr>
+          <w:highlight w:val="yellow"/>
+        </w:rPr>
+        <w:t xml:space="preserve"> in einer separaten E-Mail mitgeteilt werden so </w:t>
+      </w:r>
+      <w:proofErr w:type="spellStart"/>
+      <w:r>
+        <w:rPr>
+          <w:highlight w:val="yellow"/>
+        </w:rPr>
+        <w:t>ll</w:t>
+      </w:r>
+      <w:proofErr w:type="spellEnd"/>
+      <w:r>
+        <w:rPr>
+          <w:highlight w:val="yellow"/>
+        </w:rPr>
+        <w:t>;</w:t>
       </w:r>
     </w:p>
     <w:p>
@@ -2787,7 +3274,21 @@
         <w:rPr>
           <w:highlight w:val="yellow"/>
         </w:rPr>
-        <w:t>passwortgeschützten Speichermedien vom StAZH geöffnet werden können.</w:t>
+        <w:t xml:space="preserve">passwortgeschützten Speichermedien vom </w:t>
+      </w:r>
+      <w:proofErr w:type="spellStart"/>
+      <w:r>
+        <w:rPr>
+          <w:highlight w:val="yellow"/>
+        </w:rPr>
+        <w:t>StAZH</w:t>
+      </w:r>
+      <w:proofErr w:type="spellEnd"/>
+      <w:r>
+        <w:rPr>
+          <w:highlight w:val="yellow"/>
+        </w:rPr>
+        <w:t xml:space="preserve"> geöffnet werden können.</w:t>
       </w:r>
     </w:p>
     <w:p>
@@ -2797,9 +3298,11 @@
       <w:r>
         <w:t xml:space="preserve">Der Transport der Akten ins </w:t>
       </w:r>
+      <w:proofErr w:type="spellStart"/>
       <w:r>
         <w:t>StAZH</w:t>
       </w:r>
+      <w:proofErr w:type="spellEnd"/>
       <w:r>
         <w:t xml:space="preserve"> wird durch </w:t>
       </w:r>
@@ -2809,6 +3312,7 @@
         </w:rPr>
         <w:t>&lt;</w:t>
       </w:r>
+      <w:proofErr w:type="spellStart"/>
       <w:r>
         <w:rPr>
           <w:rFonts w:asciiTheme="majorHAnsi" w:hAnsiTheme="majorHAnsi" w:cstheme="majorHAnsi"/>
@@ -2816,6 +3320,7 @@
         </w:rPr>
         <w:t>AmtZeichen</w:t>
       </w:r>
+      <w:proofErr w:type="spellEnd"/>
       <w:r>
         <w:rPr>
           <w:highlight w:val="yellow"/>
@@ -2832,7 +3337,15 @@
         <w:t>TT.MM. 20JJ</w:t>
       </w:r>
       <w:r>
-        <w:t xml:space="preserve"> erwartet und ist dem StAZH 2</w:t>
+        <w:t xml:space="preserve"> erwartet und ist dem </w:t>
+      </w:r>
+      <w:proofErr w:type="spellStart"/>
+      <w:r>
+        <w:t>StAZH</w:t>
+      </w:r>
+      <w:proofErr w:type="spellEnd"/>
+      <w:r>
+        <w:t xml:space="preserve"> 2</w:t>
       </w:r>
       <w:r>
         <w:t>–</w:t>
@@ -2860,12 +3373,14 @@
         </w:rPr>
         <w:t xml:space="preserve"> </w:t>
       </w:r>
+      <w:proofErr w:type="spellStart"/>
       <w:r>
         <w:rPr>
           <w:b/>
         </w:rPr>
         <w:t>StAZH</w:t>
       </w:r>
+      <w:proofErr w:type="spellEnd"/>
       <w:r>
         <w:rPr>
           <w:b/>
@@ -3055,6 +3570,7 @@
       </w:rPr>
       <w:t>&lt;</w:t>
     </w:r>
+    <w:proofErr w:type="spellStart"/>
     <w:r>
       <w:rPr>
         <w:sz w:val="16"/>
@@ -3063,6 +3579,7 @@
       </w:rPr>
       <w:t>AmtZeichen</w:t>
     </w:r>
+    <w:proofErr w:type="spellEnd"/>
     <w:r>
       <w:rPr>
         <w:sz w:val="16"/>
@@ -3255,6 +3772,7 @@
       </w:rPr>
       <w:t>&lt;</w:t>
     </w:r>
+    <w:proofErr w:type="spellStart"/>
     <w:r>
       <w:rPr>
         <w:sz w:val="16"/>
@@ -3263,6 +3781,7 @@
       </w:rPr>
       <w:t>ErstellungsDatum</w:t>
     </w:r>
+    <w:proofErr w:type="spellEnd"/>
     <w:r>
       <w:rPr>
         <w:sz w:val="16"/>
@@ -3451,7 +3970,39 @@
           <w:rFonts w:ascii="Helv" w:hAnsi="Helv" w:cs="Helv"/>
           <w:color w:val="000000"/>
         </w:rPr>
-        <w:t>(frühere Ablieferungsvereinbarungen), dass das StAZH sie nicht übernimmt oder die bereits früher selbständig vernichtet wurden. Das StAZH benötigt diese Information</w:t>
+        <w:t xml:space="preserve">(frühere Ablieferungsvereinbarungen), dass das </w:t>
+      </w:r>
+      <w:proofErr w:type="spellStart"/>
+      <w:r>
+        <w:rPr>
+          <w:rFonts w:ascii="Helv" w:hAnsi="Helv" w:cs="Helv"/>
+          <w:color w:val="000000"/>
+        </w:rPr>
+        <w:t>StAZH</w:t>
+      </w:r>
+      <w:proofErr w:type="spellEnd"/>
+      <w:r>
+        <w:rPr>
+          <w:rFonts w:ascii="Helv" w:hAnsi="Helv" w:cs="Helv"/>
+          <w:color w:val="000000"/>
+        </w:rPr>
+        <w:t xml:space="preserve"> sie nicht übernimmt oder die bereits früher selbständig vernichtet wurden. Das </w:t>
+      </w:r>
+      <w:proofErr w:type="spellStart"/>
+      <w:r>
+        <w:rPr>
+          <w:rFonts w:ascii="Helv" w:hAnsi="Helv" w:cs="Helv"/>
+          <w:color w:val="000000"/>
+        </w:rPr>
+        <w:t>StAZH</w:t>
+      </w:r>
+      <w:proofErr w:type="spellEnd"/>
+      <w:r>
+        <w:rPr>
+          <w:rFonts w:ascii="Helv" w:hAnsi="Helv" w:cs="Helv"/>
+          <w:color w:val="000000"/>
+        </w:rPr>
+        <w:t xml:space="preserve"> benötigt diese Information</w:t>
       </w:r>
       <w:r>
         <w:rPr>
@@ -8998,6 +9549,7 @@
   </w:compat>
   <w:rsids>
     <w:rsidRoot w:val="003D15C2"/>
+    <w:rsid w:val="000D5573"/>
     <w:rsid w:val="003C0AE1"/>
     <w:rsid w:val="003D15C2"/>
   </w:rsids>

</xml_diff>